<commit_message>
excel match column update
</commit_message>
<xml_diff>
--- a/outputs/procedure_gsv_coding_20251103.docx
+++ b/outputs/procedure_gsv_coding_20251103.docx
@@ -43,50 +43,14 @@
       </w:pPr>
       <w:r>
         <w:rPr/>
-        <w:t>Each sampled street segment is inspected in two anchor years: follow-up (≈2023) and baseline (≈2015).</w:t>
-      </w:r>
-      <w:r>
-        <w:rPr/>
-        <w:t xml:space="preserve"> </w:t>
-      </w:r>
-      <w:r>
-        <w:rPr/>
-        <w:t xml:space="preserve">Neighbour years </w:t>
+        <w:t xml:space="preserve">Each sampled street segment is inspected in two anchor years: follow-up (≈2023) and baseline (≈2015). Neighbour years </w:t>
       </w:r>
       <w:r>
         <w:rPr>
           <w:b w:val="false"/>
           <w:bCs w:val="false"/>
         </w:rPr>
-        <w:t>(</w:t>
-      </w:r>
-      <w:r>
-        <w:rPr>
-          <w:b w:val="false"/>
-          <w:bCs w:val="false"/>
-        </w:rPr>
-        <w:t xml:space="preserve">2024, 2022 </w:t>
-      </w:r>
-      <w:r>
-        <w:rPr>
-          <w:b w:val="false"/>
-          <w:bCs w:val="false"/>
-        </w:rPr>
-        <w:t xml:space="preserve">for the follow-up and </w:t>
-      </w:r>
-      <w:r>
-        <w:rPr>
-          <w:b w:val="false"/>
-          <w:bCs w:val="false"/>
-        </w:rPr>
-        <w:t>2014, 2016</w:t>
-      </w:r>
-      <w:r>
-        <w:rPr>
-          <w:b w:val="false"/>
-          <w:bCs w:val="false"/>
-        </w:rPr>
-        <w:t xml:space="preserve"> for the baseline)</w:t>
+        <w:t>(2024, 2022 for the follow-up and 2014, 2016 for the baseline)</w:t>
       </w:r>
       <w:r>
         <w:rPr>
@@ -300,14 +264,7 @@
           <w:b/>
           <w:bCs/>
         </w:rPr>
-        <w:t>Neighbour years</w:t>
-      </w:r>
-      <w:r>
-        <w:rPr>
-          <w:b/>
-          <w:bCs/>
-        </w:rPr>
-        <w:t xml:space="preserve"> (2024, 2022)</w:t>
+        <w:t>Neighbour years (2024, 2022)</w:t>
       </w:r>
     </w:p>
     <w:p>
@@ -323,15 +280,7 @@
       </w:pPr>
       <w:r>
         <w:rPr/>
-        <w:t>Use 2024 (then 2022) when 2023 imagery is missing or when the result contradicts expectations</w:t>
-      </w:r>
-      <w:r>
-        <w:rPr/>
-        <w:t xml:space="preserve"> </w:t>
-      </w:r>
-      <w:r>
-        <w:rPr/>
-        <w:t>(for instance, when GSV imagery suggests no change despite OSM indicating one, possibly due to imagery from a slightly different date).</w:t>
+        <w:t>Use 2024 (then 2022) when 2023 imagery is missing or when the result contradicts expectations (for instance, when GSV imagery suggests no change despite OSM indicating one, possibly due to imagery from a slightly different date).</w:t>
       </w:r>
     </w:p>
     <w:p>
@@ -363,15 +312,7 @@
       </w:pPr>
       <w:r>
         <w:rPr/>
-        <w:t>If the infrastructure appears in 2022 or 2024 (but not before 2016), count it as a real ADD — the change occurred within the 2015–2023 window.</w:t>
-      </w:r>
-      <w:r>
-        <w:rPr/>
-        <w:t xml:space="preserve"> </w:t>
-      </w:r>
-      <w:r>
-        <w:rPr/>
-        <w:t>Note briefly: “appears 2022” or “appears 2024”.</w:t>
+        <w:t>If the infrastructure appears in 2022 or 2024 (but not before 2016), count it as a real ADD — the change occurred within the 2015–2023 window. Note briefly: “appears 2022” or “appears 2024”.</w:t>
       </w:r>
     </w:p>
     <w:p>
@@ -486,14 +427,7 @@
           <w:b/>
           <w:bCs/>
         </w:rPr>
-        <w:t>Neighbour years</w:t>
-      </w:r>
-      <w:r>
-        <w:rPr>
-          <w:b/>
-          <w:bCs/>
-        </w:rPr>
-        <w:t xml:space="preserve"> (2014, 2016)</w:t>
+        <w:t>Neighbour years (2014, 2016)</w:t>
       </w:r>
     </w:p>
     <w:p>
@@ -646,6 +580,23 @@
       <w:r>
         <w:rPr/>
         <w:t>earlier or later visibility (“appears 2022”, “gone 2022”, “already 2016”, etc.)</w:t>
+      </w:r>
+    </w:p>
+    <w:p>
+      <w:pPr>
+        <w:pStyle w:val="BodyText"/>
+        <w:numPr>
+          <w:ilvl w:val="0"/>
+          <w:numId w:val="6"/>
+        </w:numPr>
+        <w:bidi w:val="0"/>
+        <w:spacing w:lineRule="auto" w:line="276" w:before="0" w:after="140"/>
+        <w:jc w:val="start"/>
+        <w:rPr/>
+      </w:pPr>
+      <w:r>
+        <w:rPr/>
+        <w:t>realignments (pavement ↔ carriageway): when a cycle facility changes location within the same street segment (e.g. from pavement to carriageway or the opposite) but this change is not captured by the automated realignment detection code, record NA for both years and note “realignment not detected”. These cases represent lateral relocations rather than net additions or removals.</w:t>
       </w:r>
     </w:p>
     <w:p>
@@ -1698,7 +1649,7 @@
     <w:pPr>
       <w:widowControl/>
       <w:suppressAutoHyphens w:val="true"/>
-      <w:overflowPunct w:val="true"/>
+      <w:overflowPunct w:val="false"/>
       <w:bidi w:val="0"/>
       <w:spacing w:before="0" w:after="0"/>
       <w:jc w:val="start"/>

</xml_diff>

<commit_message>
draft abstract first version
</commit_message>
<xml_diff>
--- a/outputs/procedure_gsv_coding_20251103.docx
+++ b/outputs/procedure_gsv_coding_20251103.docx
@@ -616,7 +616,23 @@
       <w:r>
         <w:rPr/>
         <w:br/>
-        <w:t>After both researchers have finished Steps 1–3, all cases where the OSM-inferred change direction (ADD or REMOVE) is contradicted by at least one coder are jointly re-inspected to rule out human error (peg misplacement, wrong year, misinterpretation).</w:t>
+        <w:t>After both coders have completed their independent assessments</w:t>
+      </w:r>
+      <w:r>
+        <w:rPr/>
+        <w:t xml:space="preserve"> (steps 1-3)</w:t>
+      </w:r>
+      <w:r>
+        <w:rPr/>
+        <w:t>, jointly review all cases where evaluations differ to rule out potential human error (peg misplacement, misinterpretation, or incorrect year selection). If disagreement remains after discussion, retain both judgements as a disagreement. Otherwise, record the consensus code</w:t>
+      </w:r>
+      <w:r>
+        <w:rPr/>
+        <w:t>.</w:t>
+      </w:r>
+      <w:r>
+        <w:rPr/>
+        <w:t xml:space="preserve"> </w:t>
       </w:r>
     </w:p>
     <w:p>
@@ -629,7 +645,6 @@
       </w:pPr>
       <w:r>
         <w:rPr/>
-        <w:t>If ambiguity remains, the disagreement is retained.</w:t>
       </w:r>
     </w:p>
     <w:p>
@@ -642,7 +657,6 @@
       </w:pPr>
       <w:r>
         <w:rPr/>
-        <w:t>The final retained code always reflects what is visible in GSV and is not modified to force agreement with OSM.</w:t>
       </w:r>
     </w:p>
     <w:sectPr>
@@ -1649,7 +1663,7 @@
     <w:pPr>
       <w:widowControl/>
       <w:suppressAutoHyphens w:val="true"/>
-      <w:overflowPunct w:val="false"/>
+      <w:overflowPunct w:val="true"/>
       <w:bidi w:val="0"/>
       <w:spacing w:before="0" w:after="0"/>
       <w:jc w:val="start"/>

</xml_diff>